<commit_message>
Define full-time and good standing in the form, income guarantee page, and terms
Co-Authored-By: Claude Sonnet 5.5 <noreply@anthropic.com>
Claude-Session: https://claude.ai/code/session_01T9G2J1ZwSkTiNMcFXgLC6G
</commit_message>
<xml_diff>
--- a/docs/HHG_Income_Guarantee_Acknowledgment.docx
+++ b/docs/HHG_Income_Guarantee_Acknowledgment.docx
@@ -352,6 +352,55 @@
           <w:szCs w:val="22"/>
         </w:rPr>
         <w:t xml:space="preserve">Referral-only agents, part-time agents, and agents whose role is primarily inside sales or administrative and support work are not eligible, unless the Team agrees otherwise in writing.</w:t>
+      </w:r>
+    </w:p>
+    <w:p>
+      <w:pPr>
+        <w:spacing w:after="120"/>
+      </w:pPr>
+      <w:r>
+        <w:rPr>
+          <w:rFonts w:ascii="Arial" w:cs="Arial" w:eastAsia="Arial" w:hAnsi="Arial"/>
+          <w:sz w:val="22"/>
+          <w:szCs w:val="22"/>
+        </w:rPr>
+        <w:t xml:space="preserve">For purposes of this agreement:</w:t>
+      </w:r>
+    </w:p>
+    <w:p>
+      <w:pPr>
+        <w:pStyle w:val="ListParagraph"/>
+        <w:numPr>
+          <w:ilvl w:val="0"/>
+          <w:numId w:val="2"/>
+        </w:numPr>
+        <w:spacing w:after="80"/>
+      </w:pPr>
+      <w:r>
+        <w:rPr>
+          <w:rFonts w:ascii="Arial" w:cs="Arial" w:eastAsia="Arial" w:hAnsi="Arial"/>
+          <w:sz w:val="22"/>
+          <w:szCs w:val="22"/>
+        </w:rPr>
+        <w:t xml:space="preserve">"Full-time" means real estate is the agent's primary occupation and main source of working income, the agent does not hold other full-time employment, and the agent is available to meet the weekly activity standards and to attend the required meetings.</w:t>
+      </w:r>
+    </w:p>
+    <w:p>
+      <w:pPr>
+        <w:pStyle w:val="ListParagraph"/>
+        <w:numPr>
+          <w:ilvl w:val="0"/>
+          <w:numId w:val="2"/>
+        </w:numPr>
+        <w:spacing w:after="80"/>
+      </w:pPr>
+      <w:r>
+        <w:rPr>
+          <w:rFonts w:ascii="Arial" w:cs="Arial" w:eastAsia="Arial" w:hAnsi="Arial"/>
+          <w:sz w:val="22"/>
+          <w:szCs w:val="22"/>
+        </w:rPr>
+        <w:t xml:space="preserve">"Good standing" means the agent: (a) holds an active real estate license with no suspension or disciplinary action that restricts the license; (b) complies with Team policies and procedures, brokerage rules, and applicable ethical and legal standards; (c) is not under a written warning or corrective plan for a policy violation; and (d) is current on any fees or amounts owed to the Team or the brokerage.</w:t>
       </w:r>
     </w:p>
     <w:p>

</xml_diff>